<commit_message>
style: redesign login page with enterprise UI
</commit_message>
<xml_diff>
--- a/docs/คู่มือการใช้งาน-Smart-Procurement.docx
+++ b/docs/คู่มือการใช้งาน-Smart-Procurement.docx
@@ -602,7 +602,7 @@
                 <w:sz w:val="36"/>
                 <w:szCs w:val="36"/>
               </w:rPr>
-              <w:t>5</w:t>
+              <w:t>6</w:t>
             </w:r>
             <w:r>
               <w:rPr>
@@ -778,7 +778,7 @@
                 <w:sz w:val="36"/>
                 <w:szCs w:val="36"/>
               </w:rPr>
-              <w:t>6</w:t>
+              <w:t>7</w:t>
             </w:r>
             <w:r>
               <w:rPr>
@@ -866,7 +866,7 @@
                 <w:sz w:val="36"/>
                 <w:szCs w:val="36"/>
               </w:rPr>
-              <w:t>6</w:t>
+              <w:t>7</w:t>
             </w:r>
             <w:r>
               <w:rPr>
@@ -954,7 +954,7 @@
                 <w:sz w:val="36"/>
                 <w:szCs w:val="36"/>
               </w:rPr>
-              <w:t>6</w:t>
+              <w:t>7</w:t>
             </w:r>
             <w:r>
               <w:rPr>
@@ -1218,7 +1218,7 @@
                 <w:sz w:val="36"/>
                 <w:szCs w:val="36"/>
               </w:rPr>
-              <w:t>7</w:t>
+              <w:t>8</w:t>
             </w:r>
             <w:r>
               <w:rPr>
@@ -1306,7 +1306,7 @@
                 <w:sz w:val="36"/>
                 <w:szCs w:val="36"/>
               </w:rPr>
-              <w:t>7</w:t>
+              <w:t>8</w:t>
             </w:r>
             <w:r>
               <w:rPr>
@@ -1394,7 +1394,7 @@
                 <w:sz w:val="36"/>
                 <w:szCs w:val="36"/>
               </w:rPr>
-              <w:t>7</w:t>
+              <w:t>8</w:t>
             </w:r>
             <w:r>
               <w:rPr>
@@ -1482,7 +1482,7 @@
                 <w:sz w:val="36"/>
                 <w:szCs w:val="36"/>
               </w:rPr>
-              <w:t>8</w:t>
+              <w:t>9</w:t>
             </w:r>
             <w:r>
               <w:rPr>
@@ -1570,7 +1570,7 @@
                 <w:sz w:val="36"/>
                 <w:szCs w:val="36"/>
               </w:rPr>
-              <w:t>8</w:t>
+              <w:t>9</w:t>
             </w:r>
             <w:r>
               <w:rPr>
@@ -1658,7 +1658,7 @@
                 <w:sz w:val="36"/>
                 <w:szCs w:val="36"/>
               </w:rPr>
-              <w:t>8</w:t>
+              <w:t>10</w:t>
             </w:r>
             <w:r>
               <w:rPr>
@@ -1746,7 +1746,7 @@
                 <w:sz w:val="36"/>
                 <w:szCs w:val="36"/>
               </w:rPr>
-              <w:t>9</w:t>
+              <w:t>10</w:t>
             </w:r>
             <w:r>
               <w:rPr>
@@ -1834,7 +1834,7 @@
                 <w:sz w:val="36"/>
                 <w:szCs w:val="36"/>
               </w:rPr>
-              <w:t>9</w:t>
+              <w:t>10</w:t>
             </w:r>
             <w:r>
               <w:rPr>
@@ -1922,7 +1922,7 @@
                 <w:sz w:val="36"/>
                 <w:szCs w:val="36"/>
               </w:rPr>
-              <w:t>9</w:t>
+              <w:t>11</w:t>
             </w:r>
             <w:r>
               <w:rPr>
@@ -2010,7 +2010,7 @@
                 <w:sz w:val="36"/>
                 <w:szCs w:val="36"/>
               </w:rPr>
-              <w:t>10</w:t>
+              <w:t>11</w:t>
             </w:r>
             <w:r>
               <w:rPr>
@@ -2098,7 +2098,7 @@
                 <w:sz w:val="36"/>
                 <w:szCs w:val="36"/>
               </w:rPr>
-              <w:t>10</w:t>
+              <w:t>11</w:t>
             </w:r>
             <w:r>
               <w:rPr>
@@ -2186,7 +2186,7 @@
                 <w:sz w:val="36"/>
                 <w:szCs w:val="36"/>
               </w:rPr>
-              <w:t>10</w:t>
+              <w:t>12</w:t>
             </w:r>
             <w:r>
               <w:rPr>
@@ -2274,7 +2274,7 @@
                 <w:sz w:val="36"/>
                 <w:szCs w:val="36"/>
               </w:rPr>
-              <w:t>11</w:t>
+              <w:t>12</w:t>
             </w:r>
             <w:r>
               <w:rPr>
@@ -2362,7 +2362,7 @@
                 <w:sz w:val="36"/>
                 <w:szCs w:val="36"/>
               </w:rPr>
-              <w:t>11</w:t>
+              <w:t>13</w:t>
             </w:r>
             <w:r>
               <w:rPr>
@@ -2450,7 +2450,7 @@
                 <w:sz w:val="36"/>
                 <w:szCs w:val="36"/>
               </w:rPr>
-              <w:t>11</w:t>
+              <w:t>13</w:t>
             </w:r>
             <w:r>
               <w:rPr>
@@ -2538,7 +2538,7 @@
                 <w:sz w:val="36"/>
                 <w:szCs w:val="36"/>
               </w:rPr>
-              <w:t>11</w:t>
+              <w:t>13</w:t>
             </w:r>
             <w:r>
               <w:rPr>
@@ -2626,7 +2626,7 @@
                 <w:sz w:val="36"/>
                 <w:szCs w:val="36"/>
               </w:rPr>
-              <w:t>11</w:t>
+              <w:t>13</w:t>
             </w:r>
             <w:r>
               <w:rPr>
@@ -2714,7 +2714,7 @@
                 <w:sz w:val="36"/>
                 <w:szCs w:val="36"/>
               </w:rPr>
-              <w:t>11</w:t>
+              <w:t>13</w:t>
             </w:r>
             <w:r>
               <w:rPr>
@@ -2802,7 +2802,7 @@
                 <w:sz w:val="36"/>
                 <w:szCs w:val="36"/>
               </w:rPr>
-              <w:t>12</w:t>
+              <w:t>14</w:t>
             </w:r>
             <w:r>
               <w:rPr>
@@ -2890,7 +2890,7 @@
                 <w:sz w:val="36"/>
                 <w:szCs w:val="36"/>
               </w:rPr>
-              <w:t>12</w:t>
+              <w:t>14</w:t>
             </w:r>
             <w:r>
               <w:rPr>
@@ -2978,7 +2978,7 @@
                 <w:sz w:val="36"/>
                 <w:szCs w:val="36"/>
               </w:rPr>
-              <w:t>12</w:t>
+              <w:t>14</w:t>
             </w:r>
             <w:r>
               <w:rPr>
@@ -3066,7 +3066,7 @@
                 <w:sz w:val="36"/>
                 <w:szCs w:val="36"/>
               </w:rPr>
-              <w:t>12</w:t>
+              <w:t>14</w:t>
             </w:r>
             <w:r>
               <w:rPr>
@@ -3154,7 +3154,7 @@
                 <w:sz w:val="36"/>
                 <w:szCs w:val="36"/>
               </w:rPr>
-              <w:t>13</w:t>
+              <w:t>15</w:t>
             </w:r>
             <w:r>
               <w:rPr>
@@ -3242,7 +3242,7 @@
                 <w:sz w:val="36"/>
                 <w:szCs w:val="36"/>
               </w:rPr>
-              <w:t>13</w:t>
+              <w:t>15</w:t>
             </w:r>
             <w:r>
               <w:rPr>
@@ -3330,7 +3330,7 @@
                 <w:sz w:val="36"/>
                 <w:szCs w:val="36"/>
               </w:rPr>
-              <w:t>13</w:t>
+              <w:t>16</w:t>
             </w:r>
             <w:r>
               <w:rPr>
@@ -3418,7 +3418,7 @@
                 <w:sz w:val="36"/>
                 <w:szCs w:val="36"/>
               </w:rPr>
-              <w:t>13</w:t>
+              <w:t>16</w:t>
             </w:r>
             <w:r>
               <w:rPr>
@@ -3506,7 +3506,7 @@
                 <w:sz w:val="36"/>
                 <w:szCs w:val="36"/>
               </w:rPr>
-              <w:t>13</w:t>
+              <w:t>16</w:t>
             </w:r>
             <w:r>
               <w:rPr>
@@ -3594,7 +3594,7 @@
                 <w:sz w:val="36"/>
                 <w:szCs w:val="36"/>
               </w:rPr>
-              <w:t>14</w:t>
+              <w:t>16</w:t>
             </w:r>
             <w:r>
               <w:rPr>
@@ -3682,7 +3682,7 @@
                 <w:sz w:val="36"/>
                 <w:szCs w:val="36"/>
               </w:rPr>
-              <w:t>14</w:t>
+              <w:t>16</w:t>
             </w:r>
             <w:r>
               <w:rPr>
@@ -3770,7 +3770,7 @@
                 <w:sz w:val="36"/>
                 <w:szCs w:val="36"/>
               </w:rPr>
-              <w:t>14</w:t>
+              <w:t>17</w:t>
             </w:r>
             <w:r>
               <w:rPr>
@@ -3858,7 +3858,7 @@
                 <w:sz w:val="36"/>
                 <w:szCs w:val="36"/>
               </w:rPr>
-              <w:t>15</w:t>
+              <w:t>17</w:t>
             </w:r>
             <w:r>
               <w:rPr>
@@ -3946,7 +3946,7 @@
                 <w:sz w:val="36"/>
                 <w:szCs w:val="36"/>
               </w:rPr>
-              <w:t>15</w:t>
+              <w:t>18</w:t>
             </w:r>
             <w:r>
               <w:rPr>
@@ -4034,7 +4034,7 @@
                 <w:sz w:val="36"/>
                 <w:szCs w:val="36"/>
               </w:rPr>
-              <w:t>15</w:t>
+              <w:t>18</w:t>
             </w:r>
             <w:r>
               <w:rPr>
@@ -4122,7 +4122,7 @@
                 <w:sz w:val="36"/>
                 <w:szCs w:val="36"/>
               </w:rPr>
-              <w:t>16</w:t>
+              <w:t>18</w:t>
             </w:r>
             <w:r>
               <w:rPr>
@@ -4210,7 +4210,7 @@
                 <w:sz w:val="36"/>
                 <w:szCs w:val="36"/>
               </w:rPr>
-              <w:t>16</w:t>
+              <w:t>19</w:t>
             </w:r>
             <w:r>
               <w:rPr>
@@ -4298,7 +4298,7 @@
                 <w:sz w:val="36"/>
                 <w:szCs w:val="36"/>
               </w:rPr>
-              <w:t>16</w:t>
+              <w:t>19</w:t>
             </w:r>
             <w:r>
               <w:rPr>
@@ -4386,7 +4386,7 @@
                 <w:sz w:val="36"/>
                 <w:szCs w:val="36"/>
               </w:rPr>
-              <w:t>16</w:t>
+              <w:t>19</w:t>
             </w:r>
             <w:r>
               <w:rPr>
@@ -4474,7 +4474,7 @@
                 <w:sz w:val="36"/>
                 <w:szCs w:val="36"/>
               </w:rPr>
-              <w:t>16</w:t>
+              <w:t>19</w:t>
             </w:r>
             <w:r>
               <w:rPr>
@@ -4562,7 +4562,7 @@
                 <w:sz w:val="36"/>
                 <w:szCs w:val="36"/>
               </w:rPr>
-              <w:t>17</w:t>
+              <w:t>20</w:t>
             </w:r>
             <w:r>
               <w:rPr>
@@ -4650,7 +4650,7 @@
                 <w:sz w:val="36"/>
                 <w:szCs w:val="36"/>
               </w:rPr>
-              <w:t>17</w:t>
+              <w:t>20</w:t>
             </w:r>
             <w:r>
               <w:rPr>
@@ -4738,7 +4738,7 @@
                 <w:sz w:val="36"/>
                 <w:szCs w:val="36"/>
               </w:rPr>
-              <w:t>17</w:t>
+              <w:t>20</w:t>
             </w:r>
             <w:r>
               <w:rPr>
@@ -4826,7 +4826,7 @@
                 <w:sz w:val="36"/>
                 <w:szCs w:val="36"/>
               </w:rPr>
-              <w:t>17</w:t>
+              <w:t>21</w:t>
             </w:r>
             <w:r>
               <w:rPr>
@@ -4914,7 +4914,7 @@
                 <w:sz w:val="36"/>
                 <w:szCs w:val="36"/>
               </w:rPr>
-              <w:t>18</w:t>
+              <w:t>21</w:t>
             </w:r>
             <w:r>
               <w:rPr>
@@ -5002,7 +5002,7 @@
                 <w:sz w:val="36"/>
                 <w:szCs w:val="36"/>
               </w:rPr>
-              <w:t>18</w:t>
+              <w:t>22</w:t>
             </w:r>
             <w:r>
               <w:rPr>
@@ -5090,7 +5090,7 @@
                 <w:sz w:val="36"/>
                 <w:szCs w:val="36"/>
               </w:rPr>
-              <w:t>19</w:t>
+              <w:t>22</w:t>
             </w:r>
             <w:r>
               <w:rPr>
@@ -5178,7 +5178,7 @@
                 <w:sz w:val="36"/>
                 <w:szCs w:val="36"/>
               </w:rPr>
-              <w:t>19</w:t>
+              <w:t>23</w:t>
             </w:r>
             <w:r>
               <w:rPr>
@@ -5266,7 +5266,7 @@
                 <w:sz w:val="36"/>
                 <w:szCs w:val="36"/>
               </w:rPr>
-              <w:t>19</w:t>
+              <w:t>23</w:t>
             </w:r>
             <w:r>
               <w:rPr>
@@ -5354,7 +5354,7 @@
                 <w:sz w:val="36"/>
                 <w:szCs w:val="36"/>
               </w:rPr>
-              <w:t>19</w:t>
+              <w:t>23</w:t>
             </w:r>
             <w:r>
               <w:rPr>
@@ -5442,7 +5442,7 @@
                 <w:sz w:val="36"/>
                 <w:szCs w:val="36"/>
               </w:rPr>
-              <w:t>20</w:t>
+              <w:t>24</w:t>
             </w:r>
             <w:r>
               <w:rPr>
@@ -5530,7 +5530,7 @@
                 <w:sz w:val="36"/>
                 <w:szCs w:val="36"/>
               </w:rPr>
-              <w:t>20</w:t>
+              <w:t>24</w:t>
             </w:r>
             <w:r>
               <w:rPr>
@@ -5618,7 +5618,7 @@
                 <w:sz w:val="36"/>
                 <w:szCs w:val="36"/>
               </w:rPr>
-              <w:t>20</w:t>
+              <w:t>24</w:t>
             </w:r>
             <w:r>
               <w:rPr>
@@ -5706,7 +5706,7 @@
                 <w:sz w:val="36"/>
                 <w:szCs w:val="36"/>
               </w:rPr>
-              <w:t>21</w:t>
+              <w:t>25</w:t>
             </w:r>
             <w:r>
               <w:rPr>
@@ -5794,7 +5794,7 @@
                 <w:sz w:val="36"/>
                 <w:szCs w:val="36"/>
               </w:rPr>
-              <w:t>22</w:t>
+              <w:t>27</w:t>
             </w:r>
             <w:r>
               <w:rPr>
@@ -5882,7 +5882,7 @@
                 <w:sz w:val="36"/>
                 <w:szCs w:val="36"/>
               </w:rPr>
-              <w:t>22</w:t>
+              <w:t>27</w:t>
             </w:r>
             <w:r>
               <w:rPr>
@@ -5970,7 +5970,7 @@
                 <w:sz w:val="36"/>
                 <w:szCs w:val="36"/>
               </w:rPr>
-              <w:t>22</w:t>
+              <w:t>27</w:t>
             </w:r>
             <w:r>
               <w:rPr>
@@ -6058,7 +6058,7 @@
                 <w:sz w:val="36"/>
                 <w:szCs w:val="36"/>
               </w:rPr>
-              <w:t>22</w:t>
+              <w:t>28</w:t>
             </w:r>
             <w:r>
               <w:rPr>
@@ -6838,7 +6838,23 @@
                 <w:sz w:val="36"/>
                 <w:szCs w:val="36"/>
               </w:rPr>
-              <w:t>อนุมัติ/ปฏิเสธ Awards, ดูข้อมูล Supplier</w:t>
+              <w:t xml:space="preserve">อนุมัติ/ปฏิเสธ Awards, </w:t>
+            </w:r>
+            <w:r>
+              <w:rPr>
+                <w:rFonts w:ascii="DBSathorn" w:hAnsi="DBSathorn" w:cs="DB Ozone X"/>
+                <w:sz w:val="36"/>
+                <w:szCs w:val="36"/>
+              </w:rPr>
+              <w:br/>
+            </w:r>
+            <w:r>
+              <w:rPr>
+                <w:rFonts w:ascii="DBSathorn" w:hAnsi="DBSathorn" w:cs="DB Ozone X"/>
+                <w:sz w:val="36"/>
+                <w:szCs w:val="36"/>
+              </w:rPr>
+              <w:t>ดูข้อมูล Supplier</w:t>
             </w:r>
           </w:p>
         </w:tc>

</xml_diff>